<commit_message>
Korrekturlesen-Dokument auf aktuellen Live-Stand aktualisieren
Bio jetzt in Ich-Form, gestrichene/neu formulierte Saetze bei
Komplexen Verhandlungen, Vertriebsstrategien und Strategie Beratung
nachgezogen, damit die Docx wieder 1:1 der Website entspricht.
</commit_message>
<xml_diff>
--- a/docs/Pro4Ex-Website-Korrekturlesen.docx
+++ b/docs/Pro4Ex-Website-Korrekturlesen.docx
@@ -191,7 +191,7 @@
         <w:jc w:val="both"/>
       </w:pPr>
       <w:r>
-        <w:t xml:space="preserve">Jan Michaelsen ist Executive Management Consultant mit über 30 Jahren Erfahrung in der Automobilindustrie. Seine Spezialität: die kritische Schnittstelle zwischen Unternehmensstrategie und operativer Realität – insbesondere dort, wo Einkauf und Vertrieb zusammentreffen.</w:t>
+        <w:t xml:space="preserve">Ich bin Executive Management Consultant mit über 30 Jahren Erfahrung in der Automobilindustrie. Meine Spezialität: die kritische Schnittstelle zwischen Unternehmensstrategie und operativer Realität – insbesondere dort, wo Einkauf und Vertrieb zusammentreffen.</w:t>
       </w:r>
     </w:p>
     <w:p>
@@ -199,7 +199,7 @@
         <w:jc w:val="both"/>
       </w:pPr>
       <w:r>
-        <w:t xml:space="preserve">In 28 Jahren bei Mercedes-Benz hat er seine erste Führungserfahrung im Entwicklungscontrolling gesammelt und bekam dann Projektaufgaben mit internationalen Herausforderungen. Er verantwortete mehrere Jahrzehnte lang strategische Funktionen im Einkauf: von Triebstrang-Systemen über Interieur bis zum Fahrwerk. Parallel arbeitete er als Projektleiter und Strategischer Controller – eine Kombination, die ihn dazu brachte, beide Seiten des Business zu verstehen: die großen Ziele der Unternehmensleitung und die operativen Realitäten in Einkauf und Vertrieb.</w:t>
+        <w:t xml:space="preserve">In 28 Jahren bei Mercedes-Benz habe ich meine erste Führungserfahrung im Entwicklungscontrolling gesammelt und bekam dann Projektaufgaben mit internationalen Herausforderungen. Ich verantwortete mehrere Jahrzehnte lang strategische Funktionen im Einkauf: von Triebstrang-Systemen über Interieur bis zum Fahrwerk. Parallel arbeitete ich als Projektleiter und Strategischer Controller – eine Kombination, die mich dazu brachte, beide Seiten des Business zu verstehen: die großen Ziele der Unternehmensleitung und die operativen Realitäten in Einkauf und Vertrieb.</w:t>
       </w:r>
     </w:p>
     <w:p>
@@ -207,7 +207,7 @@
         <w:jc w:val="both"/>
       </w:pPr>
       <w:r>
-        <w:t xml:space="preserve">Seit 2023 bringt er diese Erfahrung als selbstständiger Consultant in neue Projekte ein.</w:t>
+        <w:t xml:space="preserve">Seit 2023 bringe ich diese Erfahrung als selbstständiger Consultant in neue Projekte ein.</w:t>
       </w:r>
     </w:p>
     <w:p>
@@ -215,7 +215,7 @@
         <w:jc w:val="both"/>
       </w:pPr>
       <w:r>
-        <w:t xml:space="preserve">Heute nutzt er genau diesen Hybrid-Ansatz als Consultant: Er hilft Unternehmen, die Bruchstellen zwischen Strategie und Umsetzung zu heilen – besonders dort, wo Einkauf und Vertrieb an ihre Grenzen stoßen. Seine Rolle ist die eines Brückenbauers, der beide Welten spricht und verbindet.</w:t>
+        <w:t xml:space="preserve">Heute nutze ich all meine Erfahrungen als Consultant: Ich helfe Unternehmen, die Bruchstellen zwischen Strategie und Umsetzung zu heilen – besonders dort, wo Einkauf und Vertrieb an ihre Grenzen stoßen. Meine Rolle ist die eines Brückenbauers, der beide Welten spricht und verbindet.</w:t>
       </w:r>
     </w:p>
     <w:p/>
@@ -437,7 +437,7 @@
         <w:jc w:val="both"/>
       </w:pPr>
       <w:r>
-        <w:t xml:space="preserve">Ich coache, begleite und verhandle komplexe Fälle wie Volumenclaims oder Regressfälle – immer auf Augenhöhe mit strategischem Scharfsinn. In der Automotive-Industrie entstehen regelmäßig Streitfälle, die existenzielle Bedeutung haben: strittige Mengenabweichungen bei Lieferanten, Regressansprüche nach Qualitätsmängeln oder Feldproblemen oder auch Preisanpassungsdebatten. Hier braucht es mehr als juristische Standardargumente.</w:t>
+        <w:t xml:space="preserve">Ich coache, begleite und verhandle komplexe Fälle wie Volumenclaims oder Regressfälle – immer auf Augenhöhe mit strategischem Scharfsinn. In der Automotive-Industrie entstehen regelmäßig Streitfälle, die existenzielle Bedeutung haben: strittige Mengenabweichungen bei Lieferanten, Regressansprüche nach Qualitätsmängeln oder Feldproblemen oder auch Preisanpassungsdebatten.</w:t>
       </w:r>
     </w:p>
     <w:p>
@@ -486,7 +486,7 @@
         <w:jc w:val="both"/>
       </w:pPr>
       <w:r>
-        <w:t xml:space="preserve">Mein Fokus liegt auf messbarem Wachstum und schlanker Absatzorganisation – ohne Ballast im Automotive-Umfeld. Das bedeutet: keine aufgeblähten Prozesse, keine Papiertigerorganisationen. Stattdessen: klare Rollen, definierte Verkaufspfade, Kennzahlen, die wirklich zählen. Das Ergebnis ist eine Vertriebsorganisation, die schnell ist, fokussiert und nachweislich profitable Deals abschließt.</w:t>
+        <w:t xml:space="preserve">Mein Fokus liegt auf messbarem Wachstum und schlanker Absatzorganisation. Das bedeutet: keine aufgeblähten Prozesse, keine Papiertigerorganisationen. Stattdessen: klare Rollen, definierte Verkaufspfade, Kennzahlen, die wirklich zählen. Das Ergebnis ist eine Vertriebsorganisation, die schnell ist, fokussiert und nachweislich profitable Deals abschließt.</w:t>
       </w:r>
     </w:p>
     <w:p/>
@@ -552,7 +552,7 @@
         <w:jc w:val="both"/>
       </w:pPr>
       <w:r>
-        <w:t xml:space="preserve">Mein Resultat: klare Handlungsprogramme für Vorstand und Management. Das sind keine dicken Powerpointpräsentationen, sondern operative Fahrpläne, die die nächsten 12–24 Monate konkret steuern. Ich begleite auch die Umsetzung – denn eine brillante Strategie, die nicht umgesetzt wird, ist wertlos. Mein Ansatz dabei: aus Strategie wird Realität.</w:t>
+        <w:t xml:space="preserve">Mein Resultat: klare Handlungsprogramme für Vorstand und Management. Das sind keine dicken Powerpointpräsentationen, sondern Umsetzungs-Fahrpläne. Ich begleite gerne die Umsetzung – denn eine brillante Strategie, die nicht umgesetzt wird, ist wertlos. Mein Ansatz dabei: aus Strategie wird Realität.</w:t>
       </w:r>
     </w:p>
     <w:p/>

</xml_diff>